<commit_message>
Cambios con el anexo de Luis Mercado
</commit_message>
<xml_diff>
--- a/07-entrega-final/reporte-final.docx
+++ b/07-entrega-final/reporte-final.docx
@@ -357,17 +357,20 @@
           <w:sz w:val="36"/>
           <w:szCs w:val="36"/>
         </w:rPr>
-        <w:t xml:space="preserve">Ingeniería del Software </w:t>
-      </w:r>
-      <w:r>
+        <w:t>Ingeniería del Software III</w:t>
+      </w:r>
+    </w:p>
+    <w:p>
+      <w:pPr>
+        <w:jc w:val="center"/>
         <w:rPr>
           <w:b/>
           <w:bCs/>
           <w:sz w:val="36"/>
           <w:szCs w:val="36"/>
-        </w:rPr>
-        <w:t>III</w:t>
-      </w:r>
+          <w:lang w:val="es-419"/>
+        </w:rPr>
+      </w:pPr>
     </w:p>
     <w:p>
       <w:pPr>
@@ -380,26 +383,24 @@
           <w:lang w:val="es-419"/>
         </w:rPr>
       </w:pPr>
-    </w:p>
-    <w:p>
-      <w:pPr>
-        <w:jc w:val="center"/>
+      <w:r>
         <w:rPr>
           <w:b/>
           <w:bCs/>
           <w:sz w:val="36"/>
           <w:szCs w:val="36"/>
-          <w:lang w:val="es-419"/>
-        </w:rPr>
-      </w:pPr>
+        </w:rPr>
+        <w:t>Fecha de Entrega</w:t>
+      </w:r>
       <w:r>
         <w:rPr>
           <w:b/>
           <w:bCs/>
           <w:sz w:val="36"/>
           <w:szCs w:val="36"/>
-        </w:rPr>
-        <w:t>Fecha de Entrega</w:t>
+          <w:lang w:val="es-419"/>
+        </w:rPr>
+        <w:t> </w:t>
       </w:r>
       <w:r>
         <w:rPr>
@@ -409,7 +410,7 @@
           <w:szCs w:val="36"/>
           <w:lang w:val="es-419"/>
         </w:rPr>
-        <w:t> </w:t>
+        <w:br/>
       </w:r>
       <w:r>
         <w:rPr>
@@ -417,36 +418,8 @@
           <w:bCs/>
           <w:sz w:val="36"/>
           <w:szCs w:val="36"/>
-          <w:lang w:val="es-419"/>
-        </w:rPr>
-        <w:br/>
-      </w:r>
-      <w:r>
-        <w:rPr>
-          <w:b/>
-          <w:bCs/>
-          <w:sz w:val="36"/>
-          <w:szCs w:val="36"/>
-        </w:rPr>
-        <w:t>6</w:t>
-      </w:r>
-      <w:r>
-        <w:rPr>
-          <w:b/>
-          <w:bCs/>
-          <w:sz w:val="36"/>
-          <w:szCs w:val="36"/>
-        </w:rPr>
-        <w:t>/06/202</w:t>
-      </w:r>
-      <w:r>
-        <w:rPr>
-          <w:b/>
-          <w:bCs/>
-          <w:sz w:val="36"/>
-          <w:szCs w:val="36"/>
-        </w:rPr>
-        <w:t>6</w:t>
+        </w:rPr>
+        <w:t>6/06/2026</w:t>
       </w:r>
     </w:p>
     <w:p>
@@ -1196,215 +1169,116 @@
     </w:p>
     <w:p>
       <w:pPr>
-        <w:rPr>
-          <w:b/>
-          <w:bCs/>
-          <w:lang w:val="es-419"/>
-        </w:rPr>
-      </w:pPr>
-      <w:r>
-        <w:rPr>
-          <w:b/>
-          <w:bCs/>
-          <w:lang w:val="es-419"/>
-        </w:rPr>
-        <w:t>2. Hallazgos (Bugs Identificados)</w:t>
+        <w:numPr>
+          <w:ilvl w:val="0"/>
+          <w:numId w:val="3"/>
+        </w:numPr>
+        <w:rPr>
+          <w:b/>
+          <w:bCs/>
+        </w:rPr>
+      </w:pPr>
+      <w:r>
+        <w:rPr>
+          <w:b/>
+          <w:bCs/>
+        </w:rPr>
+        <w:t>Hallazgos (Bugs Identificados)</w:t>
       </w:r>
     </w:p>
     <w:p>
       <w:pPr>
-        <w:rPr>
-          <w:i/>
-          <w:iCs/>
-          <w:lang w:val="es-419"/>
-        </w:rPr>
-      </w:pPr>
-      <w:r>
-        <w:rPr>
-          <w:i/>
-          <w:iCs/>
-          <w:lang w:val="es-419"/>
-        </w:rPr>
-        <w:t>Aquí puedes usar los hallazgos que detectaste en tus pruebas:</w:t>
+        <w:ind w:left="720"/>
+        <w:rPr>
+          <w:b/>
+          <w:bCs/>
+        </w:rPr>
+      </w:pPr>
+      <w:r>
+        <w:rPr>
+          <w:b/>
+          <w:bCs/>
+        </w:rPr>
+        <w:t xml:space="preserve">BUG-001: </w:t>
+      </w:r>
+      <w:r>
+        <w:t>Validación insuficiente en creación de usuarios.</w:t>
+      </w:r>
+      <w:r>
+        <w:br/>
+        <w:t>Descripción:</w:t>
+      </w:r>
+      <w:r>
+        <w:br/>
+        <w:t xml:space="preserve">Durante las pruebas de API realizadas con Postman sobre el Servlet </w:t>
+      </w:r>
+      <w:proofErr w:type="spellStart"/>
+      <w:r>
+        <w:t>CrearUsuarioServlet</w:t>
+      </w:r>
+      <w:proofErr w:type="spellEnd"/>
+      <w:r>
+        <w:t xml:space="preserve"> se verificó que el sistema permite recibir solicitudes con datos inválidos, dependiendo de los parámetros enviados. Se recomienda reforzar la validación tanto en cliente como en servidor para evitar inconsistencias.</w:t>
       </w:r>
     </w:p>
     <w:p>
       <w:pPr>
-        <w:rPr>
-          <w:lang w:val="es-419"/>
-        </w:rPr>
-      </w:pPr>
+        <w:ind w:left="720"/>
+      </w:pPr>
+      <w:r>
+        <w:rPr>
+          <w:b/>
+          <w:bCs/>
+        </w:rPr>
+        <w:t xml:space="preserve">BUG-002: </w:t>
+      </w:r>
+      <w:r>
+        <w:t>Restricciones de eliminación por dependencias.</w:t>
+      </w:r>
+      <w:r>
+        <w:br/>
+        <w:t>Descripción:</w:t>
+      </w:r>
+      <w:r>
+        <w:br/>
+        <w:t xml:space="preserve">Durante las pruebas sobre </w:t>
+      </w:r>
+      <w:proofErr w:type="spellStart"/>
+      <w:r>
+        <w:t>EliminarUsuarioServlet</w:t>
+      </w:r>
+      <w:proofErr w:type="spellEnd"/>
+      <w:r>
+        <w:t xml:space="preserve"> se comprobó que algunos usuarios no pueden ser eliminados debido a restricciones de integridad referencial y registros asociados. Aunque el comportamiento es correcto, se recomienda mostrar mensajes más específicos al usuario para facilitar la identificación de la dependencia existente.</w:t>
+      </w:r>
     </w:p>
     <w:p>
       <w:pPr>
-        <w:numPr>
-          <w:ilvl w:val="0"/>
-          <w:numId w:val="1"/>
-        </w:numPr>
-        <w:rPr>
-          <w:lang w:val="es-419"/>
-        </w:rPr>
-      </w:pPr>
-      <w:r>
-        <w:rPr>
-          <w:b/>
-          <w:bCs/>
-          <w:lang w:val="es-419"/>
-        </w:rPr>
-        <w:t xml:space="preserve">BUG-001: </w:t>
-      </w:r>
-      <w:proofErr w:type="gramStart"/>
-      <w:r>
-        <w:rPr>
-          <w:b/>
-          <w:bCs/>
-          <w:lang w:val="es-419"/>
-        </w:rPr>
-        <w:t>Bypass</w:t>
-      </w:r>
-      <w:proofErr w:type="gramEnd"/>
-      <w:r>
-        <w:rPr>
-          <w:b/>
-          <w:bCs/>
-          <w:lang w:val="es-419"/>
-        </w:rPr>
-        <w:t xml:space="preserve"> de validación en Registro.</w:t>
-      </w:r>
-      <w:r>
-        <w:rPr>
-          <w:lang w:val="es-419"/>
-        </w:rPr>
-        <w:t xml:space="preserve"> (Si lo detectaste manualmente). </w:t>
-      </w:r>
-      <w:r>
-        <w:rPr>
-          <w:i/>
-          <w:iCs/>
-          <w:lang w:val="es-419"/>
-        </w:rPr>
+        <w:ind w:left="720"/>
+        <w:rPr>
+          <w:b/>
+          <w:bCs/>
+        </w:rPr>
+      </w:pPr>
+      <w:r>
+        <w:rPr>
+          <w:b/>
+          <w:bCs/>
+        </w:rPr>
+        <w:lastRenderedPageBreak/>
+        <w:t xml:space="preserve">BUG-003: </w:t>
+      </w:r>
+      <w:r>
+        <w:t>Vulnerabilidades de seguridad detectadas por OWASP ZAP.</w:t>
+      </w:r>
+      <w:r>
+        <w:br/>
         <w:t>Descripción:</w:t>
       </w:r>
       <w:r>
-        <w:rPr>
-          <w:lang w:val="es-419"/>
-        </w:rPr>
-        <w:t xml:space="preserve"> El formulario de registro permite el envío de datos con campos vacíos.</w:t>
-      </w:r>
-    </w:p>
-    <w:p>
-      <w:pPr>
-        <w:numPr>
-          <w:ilvl w:val="0"/>
-          <w:numId w:val="1"/>
-        </w:numPr>
-        <w:rPr>
-          <w:lang w:val="es-419"/>
-        </w:rPr>
-      </w:pPr>
-      <w:r>
-        <w:rPr>
-          <w:b/>
-          <w:bCs/>
-          <w:lang w:val="es-419"/>
-        </w:rPr>
-        <w:t>BUG-002: Inconsistencia en navegación automatizada.</w:t>
-      </w:r>
-      <w:r>
-        <w:rPr>
-          <w:lang w:val="es-419"/>
-        </w:rPr>
-        <w:t xml:space="preserve"> (Debido a lo que mencionaste del 2FA y CAPTCHA). </w:t>
-      </w:r>
-      <w:r>
-        <w:rPr>
-          <w:i/>
-          <w:iCs/>
-          <w:lang w:val="es-419"/>
-        </w:rPr>
-        <w:t>Descripción:</w:t>
-      </w:r>
-      <w:r>
-        <w:rPr>
-          <w:lang w:val="es-419"/>
-        </w:rPr>
-        <w:t xml:space="preserve"> Las pruebas de </w:t>
-      </w:r>
-      <w:proofErr w:type="spellStart"/>
-      <w:r>
-        <w:rPr>
-          <w:lang w:val="es-419"/>
-        </w:rPr>
-        <w:t>Katalon</w:t>
-      </w:r>
-      <w:proofErr w:type="spellEnd"/>
-      <w:r>
-        <w:rPr>
-          <w:lang w:val="es-419"/>
-        </w:rPr>
-        <w:t xml:space="preserve"> presentan inestabilidad debido a la rotación de </w:t>
-      </w:r>
-      <w:proofErr w:type="spellStart"/>
-      <w:r>
-        <w:rPr>
-          <w:lang w:val="es-419"/>
-        </w:rPr>
-        <w:t>CAPTCHAs</w:t>
-      </w:r>
-      <w:proofErr w:type="spellEnd"/>
-      <w:r>
-        <w:rPr>
-          <w:lang w:val="es-419"/>
-        </w:rPr>
-        <w:t>, impidiendo la automatización del 100% de los casos.</w:t>
-      </w:r>
-    </w:p>
-    <w:p>
-      <w:pPr>
-        <w:numPr>
-          <w:ilvl w:val="0"/>
-          <w:numId w:val="1"/>
-        </w:numPr>
-        <w:rPr>
-          <w:lang w:val="es-419"/>
-        </w:rPr>
-      </w:pPr>
-      <w:r>
-        <w:rPr>
-          <w:b/>
-          <w:bCs/>
-          <w:lang w:val="es-419"/>
-        </w:rPr>
-        <w:t>BUG-003: Vulnerabilidades de Seguridad (ZAP).</w:t>
-      </w:r>
-      <w:r>
-        <w:rPr>
-          <w:lang w:val="es-419"/>
-        </w:rPr>
-        <w:t xml:space="preserve"> </w:t>
-      </w:r>
-      <w:r>
-        <w:rPr>
-          <w:i/>
-          <w:iCs/>
-          <w:lang w:val="es-419"/>
-        </w:rPr>
-        <w:t>Descripción:</w:t>
-      </w:r>
-      <w:r>
-        <w:rPr>
-          <w:lang w:val="es-419"/>
-        </w:rPr>
-        <w:t xml:space="preserve"> Se detectaron alertas de seguridad (XSS Reflejado y falta de cabeceras CSP) durante el escaneo automatizado.</w:t>
-      </w:r>
-    </w:p>
-    <w:p>
-      <w:pPr>
-        <w:ind w:left="720"/>
-        <w:rPr>
-          <w:lang w:val="es-419"/>
-        </w:rPr>
-      </w:pPr>
+        <w:br/>
+        <w:t>El análisis automatizado identificó vulnerabilidades relacionadas con Cross Site Scripting (XSS), ausencia de protección Anti-CSRF, falta de cabeceras CSP y configuraciones de seguridad HTTP recomendadas. Estas vulnerabilidades pueden aumentar la superficie de ataque de la aplicación.</w:t>
+      </w:r>
     </w:p>
     <w:p>
       <w:pPr>
@@ -1452,7 +1326,7 @@
       </w:tblPr>
       <w:tblGrid>
         <w:gridCol w:w="2091"/>
-        <w:gridCol w:w="3623"/>
+        <w:gridCol w:w="4065"/>
         <w:gridCol w:w="1509"/>
       </w:tblGrid>
       <w:tr>
@@ -1894,6 +1768,579 @@
           </w:p>
         </w:tc>
       </w:tr>
+      <w:tr>
+        <w:trPr>
+          <w:tblCellSpacing w:w="15" w:type="dxa"/>
+        </w:trPr>
+        <w:tc>
+          <w:tcPr>
+            <w:tcW w:w="0" w:type="auto"/>
+            <w:tcBorders>
+              <w:top w:val="single" w:sz="6" w:space="0" w:color="C4C7C5"/>
+              <w:left w:val="single" w:sz="6" w:space="0" w:color="C4C7C5"/>
+              <w:bottom w:val="single" w:sz="6" w:space="0" w:color="C4C7C5"/>
+              <w:right w:val="single" w:sz="6" w:space="0" w:color="C4C7C5"/>
+            </w:tcBorders>
+            <w:tcMar>
+              <w:top w:w="120" w:type="dxa"/>
+              <w:left w:w="180" w:type="dxa"/>
+              <w:bottom w:w="120" w:type="dxa"/>
+              <w:right w:w="180" w:type="dxa"/>
+            </w:tcMar>
+            <w:vAlign w:val="center"/>
+          </w:tcPr>
+          <w:p>
+            <w:pPr>
+              <w:rPr>
+                <w:b/>
+                <w:bCs/>
+                <w:lang w:val="es-419"/>
+              </w:rPr>
+            </w:pPr>
+            <w:r>
+              <w:rPr>
+                <w:b/>
+                <w:bCs/>
+                <w:lang w:val="es-419"/>
+              </w:rPr>
+              <w:t>Medio</w:t>
+            </w:r>
+          </w:p>
+        </w:tc>
+        <w:tc>
+          <w:tcPr>
+            <w:tcW w:w="0" w:type="auto"/>
+            <w:tcBorders>
+              <w:top w:val="single" w:sz="6" w:space="0" w:color="C4C7C5"/>
+              <w:left w:val="single" w:sz="6" w:space="0" w:color="C4C7C5"/>
+              <w:bottom w:val="single" w:sz="6" w:space="0" w:color="C4C7C5"/>
+              <w:right w:val="single" w:sz="6" w:space="0" w:color="C4C7C5"/>
+            </w:tcBorders>
+            <w:tcMar>
+              <w:top w:w="120" w:type="dxa"/>
+              <w:left w:w="180" w:type="dxa"/>
+              <w:bottom w:w="120" w:type="dxa"/>
+              <w:right w:w="180" w:type="dxa"/>
+            </w:tcMar>
+            <w:vAlign w:val="center"/>
+          </w:tcPr>
+          <w:p>
+            <w:pPr>
+              <w:rPr>
+                <w:lang w:val="es-419"/>
+              </w:rPr>
+            </w:pPr>
+            <w:r>
+              <w:rPr>
+                <w:lang w:val="es-419"/>
+              </w:rPr>
+              <w:t>Falta de cabecera Anti-</w:t>
+            </w:r>
+            <w:proofErr w:type="spellStart"/>
+            <w:r>
+              <w:rPr>
+                <w:lang w:val="es-419"/>
+              </w:rPr>
+              <w:t>Clickjacking</w:t>
+            </w:r>
+            <w:proofErr w:type="spellEnd"/>
+          </w:p>
+        </w:tc>
+        <w:tc>
+          <w:tcPr>
+            <w:tcW w:w="0" w:type="auto"/>
+            <w:tcBorders>
+              <w:top w:val="single" w:sz="6" w:space="0" w:color="C4C7C5"/>
+              <w:left w:val="single" w:sz="6" w:space="0" w:color="C4C7C5"/>
+              <w:bottom w:val="single" w:sz="6" w:space="0" w:color="C4C7C5"/>
+              <w:right w:val="single" w:sz="6" w:space="0" w:color="C4C7C5"/>
+            </w:tcBorders>
+            <w:tcMar>
+              <w:top w:w="120" w:type="dxa"/>
+              <w:left w:w="180" w:type="dxa"/>
+              <w:bottom w:w="120" w:type="dxa"/>
+              <w:right w:w="180" w:type="dxa"/>
+            </w:tcMar>
+            <w:vAlign w:val="center"/>
+          </w:tcPr>
+          <w:p>
+            <w:pPr>
+              <w:rPr>
+                <w:lang w:val="es-419"/>
+              </w:rPr>
+            </w:pPr>
+            <w:r>
+              <w:rPr>
+                <w:lang w:val="es-419"/>
+              </w:rPr>
+              <w:t>5</w:t>
+            </w:r>
+          </w:p>
+        </w:tc>
+      </w:tr>
+      <w:tr>
+        <w:trPr>
+          <w:tblCellSpacing w:w="15" w:type="dxa"/>
+        </w:trPr>
+        <w:tc>
+          <w:tcPr>
+            <w:tcW w:w="0" w:type="auto"/>
+            <w:tcBorders>
+              <w:top w:val="single" w:sz="6" w:space="0" w:color="C4C7C5"/>
+              <w:left w:val="single" w:sz="6" w:space="0" w:color="C4C7C5"/>
+              <w:bottom w:val="single" w:sz="6" w:space="0" w:color="C4C7C5"/>
+              <w:right w:val="single" w:sz="6" w:space="0" w:color="C4C7C5"/>
+            </w:tcBorders>
+            <w:tcMar>
+              <w:top w:w="120" w:type="dxa"/>
+              <w:left w:w="180" w:type="dxa"/>
+              <w:bottom w:w="120" w:type="dxa"/>
+              <w:right w:w="180" w:type="dxa"/>
+            </w:tcMar>
+            <w:vAlign w:val="center"/>
+          </w:tcPr>
+          <w:p>
+            <w:pPr>
+              <w:rPr>
+                <w:b/>
+                <w:bCs/>
+                <w:lang w:val="es-419"/>
+              </w:rPr>
+            </w:pPr>
+            <w:r>
+              <w:rPr>
+                <w:b/>
+                <w:bCs/>
+                <w:lang w:val="es-419"/>
+              </w:rPr>
+              <w:t>Medio</w:t>
+            </w:r>
+          </w:p>
+        </w:tc>
+        <w:tc>
+          <w:tcPr>
+            <w:tcW w:w="0" w:type="auto"/>
+            <w:tcBorders>
+              <w:top w:val="single" w:sz="6" w:space="0" w:color="C4C7C5"/>
+              <w:left w:val="single" w:sz="6" w:space="0" w:color="C4C7C5"/>
+              <w:bottom w:val="single" w:sz="6" w:space="0" w:color="C4C7C5"/>
+              <w:right w:val="single" w:sz="6" w:space="0" w:color="C4C7C5"/>
+            </w:tcBorders>
+            <w:tcMar>
+              <w:top w:w="120" w:type="dxa"/>
+              <w:left w:w="180" w:type="dxa"/>
+              <w:bottom w:w="120" w:type="dxa"/>
+              <w:right w:w="180" w:type="dxa"/>
+            </w:tcMar>
+            <w:vAlign w:val="center"/>
+          </w:tcPr>
+          <w:p>
+            <w:pPr>
+              <w:rPr>
+                <w:lang w:val="es-419"/>
+              </w:rPr>
+            </w:pPr>
+            <w:r>
+              <w:rPr>
+                <w:lang w:val="es-419"/>
+              </w:rPr>
+              <w:t xml:space="preserve">Falta atributo de integridad de </w:t>
+            </w:r>
+          </w:p>
+          <w:p>
+            <w:pPr>
+              <w:rPr>
+                <w:lang w:val="es-419"/>
+              </w:rPr>
+            </w:pPr>
+            <w:r>
+              <w:rPr>
+                <w:lang w:val="es-419"/>
+              </w:rPr>
+              <w:t>Recursos secundarios</w:t>
+            </w:r>
+          </w:p>
+        </w:tc>
+        <w:tc>
+          <w:tcPr>
+            <w:tcW w:w="0" w:type="auto"/>
+            <w:tcBorders>
+              <w:top w:val="single" w:sz="6" w:space="0" w:color="C4C7C5"/>
+              <w:left w:val="single" w:sz="6" w:space="0" w:color="C4C7C5"/>
+              <w:bottom w:val="single" w:sz="6" w:space="0" w:color="C4C7C5"/>
+              <w:right w:val="single" w:sz="6" w:space="0" w:color="C4C7C5"/>
+            </w:tcBorders>
+            <w:tcMar>
+              <w:top w:w="120" w:type="dxa"/>
+              <w:left w:w="180" w:type="dxa"/>
+              <w:bottom w:w="120" w:type="dxa"/>
+              <w:right w:w="180" w:type="dxa"/>
+            </w:tcMar>
+            <w:vAlign w:val="center"/>
+          </w:tcPr>
+          <w:p>
+            <w:pPr>
+              <w:rPr>
+                <w:lang w:val="es-419"/>
+              </w:rPr>
+            </w:pPr>
+            <w:r>
+              <w:rPr>
+                <w:lang w:val="es-419"/>
+              </w:rPr>
+              <w:t>5</w:t>
+            </w:r>
+          </w:p>
+        </w:tc>
+      </w:tr>
+      <w:tr>
+        <w:trPr>
+          <w:tblCellSpacing w:w="15" w:type="dxa"/>
+        </w:trPr>
+        <w:tc>
+          <w:tcPr>
+            <w:tcW w:w="0" w:type="auto"/>
+            <w:tcBorders>
+              <w:top w:val="single" w:sz="6" w:space="0" w:color="C4C7C5"/>
+              <w:left w:val="single" w:sz="6" w:space="0" w:color="C4C7C5"/>
+              <w:bottom w:val="single" w:sz="6" w:space="0" w:color="C4C7C5"/>
+              <w:right w:val="single" w:sz="6" w:space="0" w:color="C4C7C5"/>
+            </w:tcBorders>
+            <w:tcMar>
+              <w:top w:w="120" w:type="dxa"/>
+              <w:left w:w="180" w:type="dxa"/>
+              <w:bottom w:w="120" w:type="dxa"/>
+              <w:right w:w="180" w:type="dxa"/>
+            </w:tcMar>
+            <w:vAlign w:val="center"/>
+          </w:tcPr>
+          <w:p>
+            <w:pPr>
+              <w:rPr>
+                <w:b/>
+                <w:bCs/>
+                <w:lang w:val="es-419"/>
+              </w:rPr>
+            </w:pPr>
+            <w:r>
+              <w:rPr>
+                <w:b/>
+                <w:bCs/>
+                <w:lang w:val="es-419"/>
+              </w:rPr>
+              <w:t xml:space="preserve">Bajo </w:t>
+            </w:r>
+          </w:p>
+        </w:tc>
+        <w:tc>
+          <w:tcPr>
+            <w:tcW w:w="0" w:type="auto"/>
+            <w:tcBorders>
+              <w:top w:val="single" w:sz="6" w:space="0" w:color="C4C7C5"/>
+              <w:left w:val="single" w:sz="6" w:space="0" w:color="C4C7C5"/>
+              <w:bottom w:val="single" w:sz="6" w:space="0" w:color="C4C7C5"/>
+              <w:right w:val="single" w:sz="6" w:space="0" w:color="C4C7C5"/>
+            </w:tcBorders>
+            <w:tcMar>
+              <w:top w:w="120" w:type="dxa"/>
+              <w:left w:w="180" w:type="dxa"/>
+              <w:bottom w:w="120" w:type="dxa"/>
+              <w:right w:w="180" w:type="dxa"/>
+            </w:tcMar>
+            <w:vAlign w:val="center"/>
+          </w:tcPr>
+          <w:p>
+            <w:pPr>
+              <w:rPr>
+                <w:lang w:val="es-419"/>
+              </w:rPr>
+            </w:pPr>
+            <w:r>
+              <w:rPr>
+                <w:lang w:val="es-419"/>
+              </w:rPr>
+              <w:t xml:space="preserve">Cookie sin atributo </w:t>
+            </w:r>
+            <w:proofErr w:type="spellStart"/>
+            <w:r>
+              <w:rPr>
+                <w:lang w:val="es-419"/>
+              </w:rPr>
+              <w:t>SameSite</w:t>
+            </w:r>
+            <w:proofErr w:type="spellEnd"/>
+          </w:p>
+        </w:tc>
+        <w:tc>
+          <w:tcPr>
+            <w:tcW w:w="0" w:type="auto"/>
+            <w:tcBorders>
+              <w:top w:val="single" w:sz="6" w:space="0" w:color="C4C7C5"/>
+              <w:left w:val="single" w:sz="6" w:space="0" w:color="C4C7C5"/>
+              <w:bottom w:val="single" w:sz="6" w:space="0" w:color="C4C7C5"/>
+              <w:right w:val="single" w:sz="6" w:space="0" w:color="C4C7C5"/>
+            </w:tcBorders>
+            <w:tcMar>
+              <w:top w:w="120" w:type="dxa"/>
+              <w:left w:w="180" w:type="dxa"/>
+              <w:bottom w:w="120" w:type="dxa"/>
+              <w:right w:w="180" w:type="dxa"/>
+            </w:tcMar>
+            <w:vAlign w:val="center"/>
+          </w:tcPr>
+          <w:p>
+            <w:pPr>
+              <w:rPr>
+                <w:lang w:val="es-419"/>
+              </w:rPr>
+            </w:pPr>
+            <w:r>
+              <w:rPr>
+                <w:lang w:val="es-419"/>
+              </w:rPr>
+              <w:t>1</w:t>
+            </w:r>
+          </w:p>
+        </w:tc>
+      </w:tr>
+      <w:tr>
+        <w:trPr>
+          <w:tblCellSpacing w:w="15" w:type="dxa"/>
+        </w:trPr>
+        <w:tc>
+          <w:tcPr>
+            <w:tcW w:w="0" w:type="auto"/>
+            <w:tcBorders>
+              <w:top w:val="single" w:sz="6" w:space="0" w:color="C4C7C5"/>
+              <w:left w:val="single" w:sz="6" w:space="0" w:color="C4C7C5"/>
+              <w:bottom w:val="single" w:sz="6" w:space="0" w:color="C4C7C5"/>
+              <w:right w:val="single" w:sz="6" w:space="0" w:color="C4C7C5"/>
+            </w:tcBorders>
+            <w:tcMar>
+              <w:top w:w="120" w:type="dxa"/>
+              <w:left w:w="180" w:type="dxa"/>
+              <w:bottom w:w="120" w:type="dxa"/>
+              <w:right w:w="180" w:type="dxa"/>
+            </w:tcMar>
+            <w:vAlign w:val="center"/>
+          </w:tcPr>
+          <w:p>
+            <w:pPr>
+              <w:rPr>
+                <w:b/>
+                <w:bCs/>
+                <w:lang w:val="es-419"/>
+              </w:rPr>
+            </w:pPr>
+            <w:r>
+              <w:rPr>
+                <w:b/>
+                <w:bCs/>
+                <w:lang w:val="es-419"/>
+              </w:rPr>
+              <w:t>Bajo</w:t>
+            </w:r>
+          </w:p>
+        </w:tc>
+        <w:tc>
+          <w:tcPr>
+            <w:tcW w:w="0" w:type="auto"/>
+            <w:tcBorders>
+              <w:top w:val="single" w:sz="6" w:space="0" w:color="C4C7C5"/>
+              <w:left w:val="single" w:sz="6" w:space="0" w:color="C4C7C5"/>
+              <w:bottom w:val="single" w:sz="6" w:space="0" w:color="C4C7C5"/>
+              <w:right w:val="single" w:sz="6" w:space="0" w:color="C4C7C5"/>
+            </w:tcBorders>
+            <w:tcMar>
+              <w:top w:w="120" w:type="dxa"/>
+              <w:left w:w="180" w:type="dxa"/>
+              <w:bottom w:w="120" w:type="dxa"/>
+              <w:right w:w="180" w:type="dxa"/>
+            </w:tcMar>
+            <w:vAlign w:val="center"/>
+          </w:tcPr>
+          <w:p>
+            <w:pPr>
+              <w:rPr>
+                <w:lang w:val="es-419"/>
+              </w:rPr>
+            </w:pPr>
+            <w:proofErr w:type="gramStart"/>
+            <w:r>
+              <w:rPr>
+                <w:lang w:val="es-419"/>
+              </w:rPr>
+              <w:t>Falta encabezado</w:t>
+            </w:r>
+            <w:proofErr w:type="gramEnd"/>
+            <w:r>
+              <w:rPr>
+                <w:lang w:val="es-419"/>
+              </w:rPr>
+              <w:t xml:space="preserve"> </w:t>
+            </w:r>
+          </w:p>
+          <w:p>
+            <w:pPr>
+              <w:rPr>
+                <w:lang w:val="es-419"/>
+              </w:rPr>
+            </w:pPr>
+            <w:r>
+              <w:rPr>
+                <w:lang w:val="es-419"/>
+              </w:rPr>
+              <w:t>X-CONTENT-TYPE-OPTIONS</w:t>
+            </w:r>
+          </w:p>
+        </w:tc>
+        <w:tc>
+          <w:tcPr>
+            <w:tcW w:w="0" w:type="auto"/>
+            <w:tcBorders>
+              <w:top w:val="single" w:sz="6" w:space="0" w:color="C4C7C5"/>
+              <w:left w:val="single" w:sz="6" w:space="0" w:color="C4C7C5"/>
+              <w:bottom w:val="single" w:sz="6" w:space="0" w:color="C4C7C5"/>
+              <w:right w:val="single" w:sz="6" w:space="0" w:color="C4C7C5"/>
+            </w:tcBorders>
+            <w:tcMar>
+              <w:top w:w="120" w:type="dxa"/>
+              <w:left w:w="180" w:type="dxa"/>
+              <w:bottom w:w="120" w:type="dxa"/>
+              <w:right w:w="180" w:type="dxa"/>
+            </w:tcMar>
+            <w:vAlign w:val="center"/>
+          </w:tcPr>
+          <w:p>
+            <w:pPr>
+              <w:rPr>
+                <w:lang w:val="es-419"/>
+              </w:rPr>
+            </w:pPr>
+            <w:r>
+              <w:rPr>
+                <w:lang w:val="es-419"/>
+              </w:rPr>
+              <w:t>5</w:t>
+            </w:r>
+          </w:p>
+        </w:tc>
+      </w:tr>
+      <w:tr>
+        <w:trPr>
+          <w:tblCellSpacing w:w="15" w:type="dxa"/>
+        </w:trPr>
+        <w:tc>
+          <w:tcPr>
+            <w:tcW w:w="0" w:type="auto"/>
+            <w:tcBorders>
+              <w:top w:val="single" w:sz="6" w:space="0" w:color="C4C7C5"/>
+              <w:left w:val="single" w:sz="6" w:space="0" w:color="C4C7C5"/>
+              <w:bottom w:val="single" w:sz="6" w:space="0" w:color="C4C7C5"/>
+              <w:right w:val="single" w:sz="6" w:space="0" w:color="C4C7C5"/>
+            </w:tcBorders>
+            <w:tcMar>
+              <w:top w:w="120" w:type="dxa"/>
+              <w:left w:w="180" w:type="dxa"/>
+              <w:bottom w:w="120" w:type="dxa"/>
+              <w:right w:w="180" w:type="dxa"/>
+            </w:tcMar>
+            <w:vAlign w:val="center"/>
+          </w:tcPr>
+          <w:p>
+            <w:pPr>
+              <w:rPr>
+                <w:b/>
+                <w:bCs/>
+                <w:lang w:val="es-419"/>
+              </w:rPr>
+            </w:pPr>
+            <w:r>
+              <w:rPr>
+                <w:b/>
+                <w:bCs/>
+                <w:lang w:val="es-419"/>
+              </w:rPr>
+              <w:t xml:space="preserve">Bajo </w:t>
+            </w:r>
+          </w:p>
+        </w:tc>
+        <w:tc>
+          <w:tcPr>
+            <w:tcW w:w="0" w:type="auto"/>
+            <w:tcBorders>
+              <w:top w:val="single" w:sz="6" w:space="0" w:color="C4C7C5"/>
+              <w:left w:val="single" w:sz="6" w:space="0" w:color="C4C7C5"/>
+              <w:bottom w:val="single" w:sz="6" w:space="0" w:color="C4C7C5"/>
+              <w:right w:val="single" w:sz="6" w:space="0" w:color="C4C7C5"/>
+            </w:tcBorders>
+            <w:tcMar>
+              <w:top w:w="120" w:type="dxa"/>
+              <w:left w:w="180" w:type="dxa"/>
+              <w:bottom w:w="120" w:type="dxa"/>
+              <w:right w:w="180" w:type="dxa"/>
+            </w:tcMar>
+            <w:vAlign w:val="center"/>
+          </w:tcPr>
+          <w:p>
+            <w:pPr>
+              <w:rPr>
+                <w:lang w:val="es-419"/>
+              </w:rPr>
+            </w:pPr>
+            <w:r>
+              <w:rPr>
+                <w:lang w:val="es-419"/>
+              </w:rPr>
+              <w:t>Fuga de información en banner</w:t>
+            </w:r>
+          </w:p>
+          <w:p>
+            <w:pPr>
+              <w:rPr>
+                <w:lang w:val="es-419"/>
+              </w:rPr>
+            </w:pPr>
+            <w:r>
+              <w:rPr>
+                <w:lang w:val="es-419"/>
+              </w:rPr>
+              <w:t>De pagina</w:t>
+            </w:r>
+          </w:p>
+        </w:tc>
+        <w:tc>
+          <w:tcPr>
+            <w:tcW w:w="0" w:type="auto"/>
+            <w:tcBorders>
+              <w:top w:val="single" w:sz="6" w:space="0" w:color="C4C7C5"/>
+              <w:left w:val="single" w:sz="6" w:space="0" w:color="C4C7C5"/>
+              <w:bottom w:val="single" w:sz="6" w:space="0" w:color="C4C7C5"/>
+              <w:right w:val="single" w:sz="6" w:space="0" w:color="C4C7C5"/>
+            </w:tcBorders>
+            <w:tcMar>
+              <w:top w:w="120" w:type="dxa"/>
+              <w:left w:w="180" w:type="dxa"/>
+              <w:bottom w:w="120" w:type="dxa"/>
+              <w:right w:w="180" w:type="dxa"/>
+            </w:tcMar>
+            <w:vAlign w:val="center"/>
+          </w:tcPr>
+          <w:p>
+            <w:pPr>
+              <w:rPr>
+                <w:lang w:val="es-419"/>
+              </w:rPr>
+            </w:pPr>
+            <w:r>
+              <w:rPr>
+                <w:lang w:val="es-419"/>
+              </w:rPr>
+              <w:t>2</w:t>
+            </w:r>
+          </w:p>
+        </w:tc>
+      </w:tr>
     </w:tbl>
     <w:p>
       <w:pPr>
@@ -1979,6 +2426,7 @@
           <w:noProof/>
           <w:lang w:val="es-419"/>
         </w:rPr>
+        <w:lastRenderedPageBreak/>
         <w:drawing>
           <wp:inline distT="0" distB="0" distL="0" distR="0" wp14:anchorId="504DEDF7" wp14:editId="33C88C87">
             <wp:extent cx="3878580" cy="2180332"/>
@@ -2278,6 +2726,7 @@
           <w:noProof/>
           <w:lang w:val="es-419"/>
         </w:rPr>
+        <w:lastRenderedPageBreak/>
         <w:drawing>
           <wp:inline distT="0" distB="0" distL="0" distR="0" wp14:anchorId="071C298D" wp14:editId="311A719D">
             <wp:extent cx="3604260" cy="2021033"/>
@@ -2551,8 +3000,10 @@
       </w:pPr>
       <w:r>
         <w:rPr>
-          <w:lang w:val="es-419"/>
-        </w:rPr>
+          <w:noProof/>
+          <w:lang w:val="es-419"/>
+        </w:rPr>
+        <w:lastRenderedPageBreak/>
         <w:drawing>
           <wp:inline distT="0" distB="0" distL="0" distR="0" wp14:anchorId="486868BC" wp14:editId="5329936A">
             <wp:extent cx="4579620" cy="2574690"/>
@@ -2631,9 +3082,39 @@
         <w:rPr>
           <w:lang w:val="es-419"/>
         </w:rPr>
-        <w:t xml:space="preserve"> ha sido sometido a un riguroso proceso de aseguramiento de calidad. Se logró validar la integridad de la base de datos y la funcionalidad de los servicios API. Se recomienda para futuras versiones implementar medidas de seguridad adicionales como protección contra CSRF y una mejor gestión de elementos dinámicos (CAPTCHA) para optimizar las pruebas automatizadas.</w:t>
+        <w:t xml:space="preserve"> ha sido sometido a un riguroso proceso de aseguramiento de calidad. Se logró validar la integridad de la base de datos y la funcionalidad de los servicios API. Se recomienda para futuras versiones implementar medidas de seguridad adicionales como protección contra CSRF y una mejor gestión de elementos dinámicos (CAPTCHA) para optimizar las pruebas automatizadas</w:t>
+      </w:r>
+      <w:r>
+        <w:rPr>
+          <w:lang w:val="es-419"/>
+        </w:rPr>
+        <w:t>.</w:t>
       </w:r>
     </w:p>
+    <w:p>
+      <w:r>
+        <w:t xml:space="preserve">Las pruebas ejecutadas permitieron validar correctamente los módulos trabajados durante el proceso de aseguramiento de calidad del sistema </w:t>
+      </w:r>
+      <w:proofErr w:type="spellStart"/>
+      <w:r>
+        <w:t>SumixKids</w:t>
+      </w:r>
+      <w:proofErr w:type="spellEnd"/>
+      <w:r>
+        <w:t>. Las pruebas de API verificaron operaciones de creación, actualización y eliminación de registros, mientras que las pruebas de base de datos confirmaron la integridad de la información y el correcto funcionamiento de las transacciones COMMIT y ROLLBACK.</w:t>
+      </w:r>
+    </w:p>
+    <w:p>
+      <w:r>
+        <w:t>El análisis de seguridad realizado mediante OWASP ZAP permitió identificar vulnerabilidades comunes en aplicaciones web, principalmente relacionadas con XSS, protección CSRF y configuración de cabeceras HTTP. Aunque estas vulnerabilidades no impiden el funcionamiento del sistema, se recomienda atenderlas en futuras versiones para fortalecer la seguridad general de la aplicación.</w:t>
+      </w:r>
+    </w:p>
+    <w:p>
+      <w:r>
+        <w:t>En términos generales, el sistema presentó un comportamiento estable durante las pruebas realizadas y cumplió con los criterios de aceptación definidos para las funcionalidades evaluadas.</w:t>
+      </w:r>
+    </w:p>
+    <w:p/>
     <w:p/>
     <w:sectPr>
       <w:pgSz w:w="11906" w:h="16838"/>
@@ -2945,11 +3426,127 @@
       </w:rPr>
     </w:lvl>
   </w:abstractNum>
+  <w:abstractNum w:abstractNumId="2" w15:restartNumberingAfterBreak="0">
+    <w:nsid w:val="78581F81"/>
+    <w:multiLevelType w:val="multilevel"/>
+    <w:tmpl w:val="9D0A1006"/>
+    <w:lvl w:ilvl="0">
+      <w:start w:val="2"/>
+      <w:numFmt w:val="decimal"/>
+      <w:lvlText w:val="%1."/>
+      <w:lvlJc w:val="left"/>
+      <w:pPr>
+        <w:tabs>
+          <w:tab w:val="num" w:pos="720"/>
+        </w:tabs>
+        <w:ind w:left="720" w:hanging="360"/>
+      </w:pPr>
+    </w:lvl>
+    <w:lvl w:ilvl="1" w:tentative="1">
+      <w:start w:val="1"/>
+      <w:numFmt w:val="decimal"/>
+      <w:lvlText w:val="%2."/>
+      <w:lvlJc w:val="left"/>
+      <w:pPr>
+        <w:tabs>
+          <w:tab w:val="num" w:pos="1440"/>
+        </w:tabs>
+        <w:ind w:left="1440" w:hanging="360"/>
+      </w:pPr>
+    </w:lvl>
+    <w:lvl w:ilvl="2" w:tentative="1">
+      <w:start w:val="1"/>
+      <w:numFmt w:val="decimal"/>
+      <w:lvlText w:val="%3."/>
+      <w:lvlJc w:val="left"/>
+      <w:pPr>
+        <w:tabs>
+          <w:tab w:val="num" w:pos="2160"/>
+        </w:tabs>
+        <w:ind w:left="2160" w:hanging="360"/>
+      </w:pPr>
+    </w:lvl>
+    <w:lvl w:ilvl="3" w:tentative="1">
+      <w:start w:val="1"/>
+      <w:numFmt w:val="decimal"/>
+      <w:lvlText w:val="%4."/>
+      <w:lvlJc w:val="left"/>
+      <w:pPr>
+        <w:tabs>
+          <w:tab w:val="num" w:pos="2880"/>
+        </w:tabs>
+        <w:ind w:left="2880" w:hanging="360"/>
+      </w:pPr>
+    </w:lvl>
+    <w:lvl w:ilvl="4" w:tentative="1">
+      <w:start w:val="1"/>
+      <w:numFmt w:val="decimal"/>
+      <w:lvlText w:val="%5."/>
+      <w:lvlJc w:val="left"/>
+      <w:pPr>
+        <w:tabs>
+          <w:tab w:val="num" w:pos="3600"/>
+        </w:tabs>
+        <w:ind w:left="3600" w:hanging="360"/>
+      </w:pPr>
+    </w:lvl>
+    <w:lvl w:ilvl="5" w:tentative="1">
+      <w:start w:val="1"/>
+      <w:numFmt w:val="decimal"/>
+      <w:lvlText w:val="%6."/>
+      <w:lvlJc w:val="left"/>
+      <w:pPr>
+        <w:tabs>
+          <w:tab w:val="num" w:pos="4320"/>
+        </w:tabs>
+        <w:ind w:left="4320" w:hanging="360"/>
+      </w:pPr>
+    </w:lvl>
+    <w:lvl w:ilvl="6" w:tentative="1">
+      <w:start w:val="1"/>
+      <w:numFmt w:val="decimal"/>
+      <w:lvlText w:val="%7."/>
+      <w:lvlJc w:val="left"/>
+      <w:pPr>
+        <w:tabs>
+          <w:tab w:val="num" w:pos="5040"/>
+        </w:tabs>
+        <w:ind w:left="5040" w:hanging="360"/>
+      </w:pPr>
+    </w:lvl>
+    <w:lvl w:ilvl="7" w:tentative="1">
+      <w:start w:val="1"/>
+      <w:numFmt w:val="decimal"/>
+      <w:lvlText w:val="%8."/>
+      <w:lvlJc w:val="left"/>
+      <w:pPr>
+        <w:tabs>
+          <w:tab w:val="num" w:pos="5760"/>
+        </w:tabs>
+        <w:ind w:left="5760" w:hanging="360"/>
+      </w:pPr>
+    </w:lvl>
+    <w:lvl w:ilvl="8" w:tentative="1">
+      <w:start w:val="1"/>
+      <w:numFmt w:val="decimal"/>
+      <w:lvlText w:val="%9."/>
+      <w:lvlJc w:val="left"/>
+      <w:pPr>
+        <w:tabs>
+          <w:tab w:val="num" w:pos="6480"/>
+        </w:tabs>
+        <w:ind w:left="6480" w:hanging="360"/>
+      </w:pPr>
+    </w:lvl>
+  </w:abstractNum>
   <w:num w:numId="1" w16cid:durableId="1577935565">
     <w:abstractNumId w:val="1"/>
   </w:num>
   <w:num w:numId="2" w16cid:durableId="562982698">
     <w:abstractNumId w:val="0"/>
+  </w:num>
+  <w:num w:numId="3" w16cid:durableId="269166521">
+    <w:abstractNumId w:val="2"/>
   </w:num>
 </w:numbering>
 </file>

</xml_diff>